<commit_message>
Add new Jupyter notebook for assignment 3, implementing a grocery recommendation system. Included data loading, preprocessing, exploratory data analysis, and modularized utility matrix creation. Updated existing notebook to improve clarity and functionality, including adjustments to date handling and enhanced recommendation methods.
</commit_message>
<xml_diff>
--- a/MBD_2025_Tri1_assignment3a_a1779263_AryanMoradi_version04.docx
+++ b/MBD_2025_Tri1_assignment3a_a1779263_AryanMoradi_version04.docx
@@ -683,13 +683,7 @@
         <w:t xml:space="preserve">. </w:t>
       </w:r>
       <w:r>
-        <w:t xml:space="preserve">This formula translates to looking at ALL past </w:t>
-      </w:r>
-      <w:r>
-        <w:t>transactions but</w:t>
-      </w:r>
-      <w:r>
-        <w:t xml:space="preserve"> shrink each one’s importance the older it is. Lambda here is the decay factor calculated based on the half-life we determine.</w:t>
+        <w:t>This formula translates to looking at ALL past transactions but shrink each one’s importance the older it is. Lambda here is the decay factor calculated based on the half-life we determine.</w:t>
       </w:r>
       <w:r>
         <w:t xml:space="preserve"> </w:t>
@@ -704,10 +698,7 @@
         <w:t>np.log(2) / HALF_LIFE_DAYS</w:t>
       </w:r>
       <w:r>
-        <w:t xml:space="preserve">`. </w:t>
-      </w:r>
-      <w:r>
-        <w:t xml:space="preserve">If we for example set the half-life to 180 days, that would mean that </w:t>
+        <w:t xml:space="preserve">`. If we for example set the half-life to 180 days, that would mean that </w:t>
       </w:r>
     </w:p>
     <w:p>
@@ -886,13 +877,7 @@
       </w:r>
       <w:proofErr w:type="spellEnd"/>
       <w:r>
-        <w:t xml:space="preserve"> positive values</w:t>
-      </w:r>
-      <w:r>
-        <w:t>, which 5 in our case,</w:t>
-      </w:r>
-      <w:r>
-        <w:t xml:space="preserve"> and if there are no positive values for this candidate, we skip it. This is mainly because, as per the explored example during lecture 10, we cannot consider the positive similarity weights for the items that the user themselves haven’t bought yet since doing so would lead to a multiplication by a NaN value. Moving on, we calculate the score for the target item by multiplying the similarity weight between the target item and the rest of the items we obtained by the weight score of the target users purchase, sum the up and divide by the sum of the similarity weights of the similar items we </w:t>
+        <w:t xml:space="preserve"> positive values, which 5 in our case, and if there are no positive values for this candidate, we skip it. This is mainly because, as per the explored example during lecture 10, we cannot consider the positive similarity weights for the items that the user themselves haven’t bought yet since doing so would lead to a multiplication by a NaN value. Moving on, we calculate the score for the target item by multiplying the similarity weight between the target item and the rest of the items we obtained by the weight score of the target users purchase, sum the up and divide by the sum of the similarity weights of the similar items we </w:t>
       </w:r>
       <w:r>
         <w:t xml:space="preserve">obtained, and we populate the dictionary with our results. Finally, we look through the resulting scores dictionary to grab the </w:t>
@@ -917,6 +902,313 @@
     <w:p>
       <w:r>
         <w:t>Finally for this version we do a basic test and print the results to have a sanity check of the results and to see if our functions is working as intended.</w:t>
+      </w:r>
+    </w:p>
+    <w:p/>
+    <w:p>
+      <w:r>
+        <w:t>Task 2 Version 4 draft:</w:t>
+      </w:r>
+      <w:r>
+        <w:br/>
+        <w:t xml:space="preserve">In this version we start off by first modularizing the utility matrix creation into a separate function that can take the half-life as input dynamically for a more robust testing and evaluation setup later. Same as before we calculate the decay first based on the input half-life in days. Then find the max date of the current dataset we are working with to be used for calculating the difference in days, or delta t. Next, we add helper recency columns to a copy of our </w:t>
+      </w:r>
+      <w:proofErr w:type="spellStart"/>
+      <w:r>
+        <w:t>dataframe</w:t>
+      </w:r>
+      <w:proofErr w:type="spellEnd"/>
+      <w:r>
+        <w:t xml:space="preserve"> and using that we generate the user item interaction utility matrix.</w:t>
+      </w:r>
+    </w:p>
+    <w:p>
+      <w:r>
+        <w:t xml:space="preserve">We then shift our focus to developing the collaborative filtering function that works based on the generated input from task 1. For </w:t>
+      </w:r>
+      <w:r>
+        <w:t>now,</w:t>
+      </w:r>
+      <w:r>
+        <w:t xml:space="preserve"> before integrating th</w:t>
+      </w:r>
+      <w:r>
+        <w:t xml:space="preserve">e rest of the tasks, we obtain </w:t>
+      </w:r>
+      <w:r>
+        <w:lastRenderedPageBreak/>
+        <w:t xml:space="preserve">a .xlsx file from task 1 as input. The file includes numerous rows of generated association rules that can be used input for our CF function. Delving deeper into the function’s logic, it starts off by getting the association rules, user utility matrix, user id and top K recommendation as input. It gets the target user’s current items that have a non-zero scoring on the matrix and initializes a dictionary for keeping track of the recommendations. Next for it cleans up the input data columns of </w:t>
+      </w:r>
+      <w:r>
+        <w:t>antecedent</w:t>
+      </w:r>
+      <w:r>
+        <w:t xml:space="preserve"> and </w:t>
+      </w:r>
+      <w:r>
+        <w:t>consequent</w:t>
+      </w:r>
+      <w:r>
+        <w:t xml:space="preserve"> to be easily accessible and readable for the code. The function then iterates through all the rows of the rules, grabbing both the </w:t>
+      </w:r>
+      <w:r>
+        <w:t>antecedent</w:t>
+      </w:r>
+      <w:r>
+        <w:t xml:space="preserve"> and </w:t>
+      </w:r>
+      <w:r>
+        <w:t>consequent</w:t>
+      </w:r>
+      <w:r>
+        <w:t xml:space="preserve"> and looking up the intersection of the target </w:t>
+      </w:r>
+      <w:proofErr w:type="gramStart"/>
+      <w:r>
+        <w:t>users</w:t>
+      </w:r>
+      <w:proofErr w:type="gramEnd"/>
+      <w:r>
+        <w:t xml:space="preserve"> utility scoring matrix row with the </w:t>
+      </w:r>
+      <w:r>
+        <w:t>antecedent</w:t>
+      </w:r>
+      <w:r>
+        <w:t xml:space="preserve">. What this does is basically calculate the overlap of the items that the user has bought throughout their transaction history with any cases of the </w:t>
+      </w:r>
+      <w:r>
+        <w:t>antecedent</w:t>
+      </w:r>
+      <w:r>
+        <w:t xml:space="preserve"> present on the </w:t>
+      </w:r>
+      <w:proofErr w:type="gramStart"/>
+      <w:r>
+        <w:t>left hand</w:t>
+      </w:r>
+      <w:proofErr w:type="gramEnd"/>
+      <w:r>
+        <w:t xml:space="preserve"> side of the association rules. If more items from the target user’s purchases history can be found on the </w:t>
+      </w:r>
+      <w:proofErr w:type="gramStart"/>
+      <w:r>
+        <w:t>left hand</w:t>
+      </w:r>
+      <w:proofErr w:type="gramEnd"/>
+      <w:r>
+        <w:t xml:space="preserve"> side of the rule all together as an </w:t>
+      </w:r>
+      <w:r>
+        <w:t>antecedent</w:t>
+      </w:r>
+      <w:r>
+        <w:t xml:space="preserve">, along with a strong lift, that means that we can grab the </w:t>
+      </w:r>
+      <w:r>
+        <w:t>consequent</w:t>
+      </w:r>
+      <w:r>
+        <w:t xml:space="preserve"> of that rule and score it more strongly. To keep track of the overlap score, the function divides the number of items that exactly </w:t>
+      </w:r>
+      <w:proofErr w:type="spellStart"/>
+      <w:r>
+        <w:t>overalp</w:t>
+      </w:r>
+      <w:proofErr w:type="spellEnd"/>
+      <w:r>
+        <w:t xml:space="preserve"> by the total number of the </w:t>
+      </w:r>
+      <w:r>
+        <w:t>antecedent</w:t>
+      </w:r>
+      <w:r>
+        <w:t xml:space="preserve">s on the </w:t>
+      </w:r>
+      <w:proofErr w:type="gramStart"/>
+      <w:r>
+        <w:t>left hand</w:t>
+      </w:r>
+      <w:proofErr w:type="gramEnd"/>
+      <w:r>
+        <w:t xml:space="preserve"> side. Once this is done, and for example we know based on the </w:t>
+      </w:r>
+      <w:proofErr w:type="gramStart"/>
+      <w:r>
+        <w:t>left hand</w:t>
+      </w:r>
+      <w:proofErr w:type="gramEnd"/>
+      <w:r>
+        <w:t xml:space="preserve"> side that this rule is highly relevant to our target user, we look to the </w:t>
+      </w:r>
+      <w:proofErr w:type="gramStart"/>
+      <w:r>
+        <w:t>right hand</w:t>
+      </w:r>
+      <w:proofErr w:type="gramEnd"/>
+      <w:r>
+        <w:t xml:space="preserve"> side of the equation for the </w:t>
+      </w:r>
+      <w:r>
+        <w:t>consequent</w:t>
+      </w:r>
+      <w:r>
+        <w:t xml:space="preserve">, however we must ensure that the items present are not in the user’s purchase history since we don’t want to recommend something they have already bought. </w:t>
+      </w:r>
+      <w:r>
+        <w:t>Once this is handled, f</w:t>
+      </w:r>
+      <w:r>
+        <w:t xml:space="preserve">or each item in the rule’s consequent that the user hasn’t already bought, </w:t>
+      </w:r>
+      <w:r>
+        <w:t>the function</w:t>
+      </w:r>
+      <w:r>
+        <w:t xml:space="preserve"> builds a score:</w:t>
+      </w:r>
+      <w:r>
+        <w:t xml:space="preserve"> `</w:t>
+      </w:r>
+      <w:proofErr w:type="spellStart"/>
+      <w:r>
+        <w:t>recency_score</w:t>
+      </w:r>
+      <w:proofErr w:type="spellEnd"/>
+      <w:r>
+        <w:t>`</w:t>
+      </w:r>
+      <w:r>
+        <w:t xml:space="preserve"> is the average of the user’s recency-weighted values for the overlapping items (reflecting how recently the user bought things that trigger the rule).</w:t>
+      </w:r>
+      <w:r>
+        <w:t xml:space="preserve"> `</w:t>
+      </w:r>
+      <w:proofErr w:type="spellStart"/>
+      <w:r>
+        <w:t>rule_score</w:t>
+      </w:r>
+      <w:proofErr w:type="spellEnd"/>
+      <w:r>
+        <w:t>`</w:t>
+      </w:r>
+      <w:r>
+        <w:t xml:space="preserve"> is the rule’s own strength (confidence </w:t>
+      </w:r>
+      <w:r>
+        <w:t>*</w:t>
+      </w:r>
+      <w:r>
+        <w:t xml:space="preserve"> lift) adjusted by </w:t>
+      </w:r>
+      <w:proofErr w:type="spellStart"/>
+      <w:r>
+        <w:t>overlap_score</w:t>
+      </w:r>
+      <w:proofErr w:type="spellEnd"/>
+      <w:r>
+        <w:t>.</w:t>
+      </w:r>
+      <w:r>
+        <w:t xml:space="preserve"> `</w:t>
+      </w:r>
+      <w:proofErr w:type="spellStart"/>
+      <w:r>
+        <w:t>final_score</w:t>
+      </w:r>
+      <w:proofErr w:type="spellEnd"/>
+      <w:r>
+        <w:t>`</w:t>
+      </w:r>
+      <w:r>
+        <w:t xml:space="preserve"> multiplies </w:t>
+      </w:r>
+      <w:proofErr w:type="spellStart"/>
+      <w:r>
+        <w:t>rule_score</w:t>
+      </w:r>
+      <w:proofErr w:type="spellEnd"/>
+      <w:r>
+        <w:t xml:space="preserve"> by (1 + </w:t>
+      </w:r>
+      <w:proofErr w:type="spellStart"/>
+      <w:r>
+        <w:t>recency_score</w:t>
+      </w:r>
+      <w:proofErr w:type="spellEnd"/>
+      <w:r>
+        <w:t xml:space="preserve">) so that recent </w:t>
+      </w:r>
+      <w:proofErr w:type="spellStart"/>
+      <w:r>
+        <w:t>behaviour</w:t>
+      </w:r>
+      <w:proofErr w:type="spellEnd"/>
+      <w:r>
+        <w:t xml:space="preserve"> boosts the recommendation.</w:t>
+      </w:r>
+      <w:r>
+        <w:t xml:space="preserve"> </w:t>
+      </w:r>
+      <w:r>
+        <w:t xml:space="preserve">That </w:t>
+      </w:r>
+      <w:proofErr w:type="spellStart"/>
+      <w:r>
+        <w:t>final_score</w:t>
+      </w:r>
+      <w:proofErr w:type="spellEnd"/>
+      <w:r>
+        <w:t xml:space="preserve"> is added into the running total for the candidate item in recommendations. After every rule has been processed, the dictionary is sorted from highest to lowest score, and the function returns the first </w:t>
+      </w:r>
+      <w:r>
+        <w:t>`</w:t>
+      </w:r>
+      <w:proofErr w:type="spellStart"/>
+      <w:r>
+        <w:t>top_n</w:t>
+      </w:r>
+      <w:proofErr w:type="spellEnd"/>
+      <w:r>
+        <w:t>`</w:t>
+      </w:r>
+      <w:r>
+        <w:t xml:space="preserve"> entries as the recommended items.</w:t>
+      </w:r>
+      <w:r>
+        <w:t xml:space="preserve"> </w:t>
+      </w:r>
+      <w:proofErr w:type="gramStart"/>
+      <w:r>
+        <w:t>Next</w:t>
+      </w:r>
+      <w:proofErr w:type="gramEnd"/>
+      <w:r>
+        <w:t xml:space="preserve"> we develop a function to handle the test case edge case for when a user is a fresh costumer and has no shopping history. The function simply </w:t>
+      </w:r>
+      <w:proofErr w:type="spellStart"/>
+      <w:r>
+        <w:t>retunrs</w:t>
+      </w:r>
+      <w:proofErr w:type="spellEnd"/>
+      <w:r>
+        <w:t xml:space="preserve"> the top k list of the most bought items based on the `</w:t>
+      </w:r>
+      <w:r>
+        <w:t xml:space="preserve"> </w:t>
+      </w:r>
+      <w:proofErr w:type="spellStart"/>
+      <w:r>
+        <w:t>itemDescription</w:t>
+      </w:r>
+      <w:proofErr w:type="spellEnd"/>
+      <w:r>
+        <w:t>` in the dataset.</w:t>
+      </w:r>
+    </w:p>
+    <w:p>
+      <w:r>
+        <w:t xml:space="preserve"> </w:t>
       </w:r>
     </w:p>
     <w:sectPr>

</xml_diff>